<commit_message>
testbenches: datapath . now working on top level testbench (1-2 working days)
</commit_message>
<xml_diff>
--- a/docs/risc nadav.docx
+++ b/docs/risc nadav.docx
@@ -9669,7 +9669,6 @@
           <w:lang w:val="en-US"/>
         </w:rPr>
       </w:pPr>
-      <w:proofErr w:type="spellStart"/>
       <w:r>
         <w:rPr>
           <w:rFonts w:ascii="Calibri" w:hAnsi="Calibri" w:cs="Calibri"/>
@@ -9679,10 +9678,82 @@
           <w:lang w:val="en-US"/>
         </w:rPr>
         <w:lastRenderedPageBreak/>
-        <w:t>Verfication</w:t>
-      </w:r>
-      <w:proofErr w:type="spellEnd"/>
-      <w:r>
+        <w:t>ALU:</w:t>
+      </w:r>
+    </w:p>
+    <w:p>
+      <w:pPr>
+        <w:rPr>
+          <w:rFonts w:ascii="Calibri" w:hAnsi="Calibri" w:cs="Calibri"/>
+          <w:lang w:val="en-US"/>
+        </w:rPr>
+      </w:pPr>
+      <w:r>
+        <w:rPr>
+          <w:rFonts w:ascii="Calibri" w:hAnsi="Calibri" w:cs="Calibri"/>
+          <w:noProof/>
+          <w:lang w:val="en-US"/>
+        </w:rPr>
+        <w:drawing>
+          <wp:inline distT="0" distB="0" distL="0" distR="0" wp14:anchorId="0B5064CE" wp14:editId="4FF6433C">
+            <wp:extent cx="5237480" cy="2199005"/>
+            <wp:effectExtent l="0" t="0" r="0" b="0"/>
+            <wp:docPr id="1347144989" name="Picture 1"/>
+            <wp:cNvGraphicFramePr>
+              <a:graphicFrameLocks xmlns:a="http://schemas.openxmlformats.org/drawingml/2006/main" noChangeAspect="1"/>
+            </wp:cNvGraphicFramePr>
+            <a:graphic xmlns:a="http://schemas.openxmlformats.org/drawingml/2006/main">
+              <a:graphicData uri="http://schemas.openxmlformats.org/drawingml/2006/picture">
+                <pic:pic xmlns:pic="http://schemas.openxmlformats.org/drawingml/2006/picture">
+                  <pic:nvPicPr>
+                    <pic:cNvPr id="0" name="Picture 1"/>
+                    <pic:cNvPicPr>
+                      <a:picLocks noChangeAspect="1" noChangeArrowheads="1"/>
+                    </pic:cNvPicPr>
+                  </pic:nvPicPr>
+                  <pic:blipFill>
+                    <a:blip r:embed="rId10">
+                      <a:extLst>
+                        <a:ext uri="{28A0092B-C50C-407E-A947-70E740481C1C}">
+                          <a14:useLocalDpi xmlns:a14="http://schemas.microsoft.com/office/drawing/2010/main" val="0"/>
+                        </a:ext>
+                      </a:extLst>
+                    </a:blip>
+                    <a:srcRect/>
+                    <a:stretch>
+                      <a:fillRect/>
+                    </a:stretch>
+                  </pic:blipFill>
+                  <pic:spPr bwMode="auto">
+                    <a:xfrm>
+                      <a:off x="0" y="0"/>
+                      <a:ext cx="5237480" cy="2199005"/>
+                    </a:xfrm>
+                    <a:prstGeom prst="rect">
+                      <a:avLst/>
+                    </a:prstGeom>
+                    <a:noFill/>
+                    <a:ln>
+                      <a:noFill/>
+                    </a:ln>
+                  </pic:spPr>
+                </pic:pic>
+              </a:graphicData>
+            </a:graphic>
+          </wp:inline>
+        </w:drawing>
+      </w:r>
+    </w:p>
+    <w:p>
+      <w:pPr>
+        <w:rPr>
+          <w:rFonts w:ascii="Calibri" w:hAnsi="Calibri" w:cs="Calibri"/>
+          <w:lang w:val="en-US"/>
+        </w:rPr>
+      </w:pPr>
+    </w:p>
+    <w:p>
+      <w:pPr>
         <w:rPr>
           <w:rFonts w:ascii="Calibri" w:hAnsi="Calibri" w:cs="Calibri"/>
           <w:b/>
@@ -9690,26 +9761,8 @@
           <w:u w:val="single"/>
           <w:lang w:val="en-US"/>
         </w:rPr>
-        <w:t xml:space="preserve"> </w:t>
-      </w:r>
-    </w:p>
-    <w:p>
-      <w:pPr>
-        <w:rPr>
-          <w:rFonts w:ascii="Calibri" w:hAnsi="Calibri" w:cs="Calibri"/>
-          <w:lang w:val="en-US"/>
-        </w:rPr>
-      </w:pPr>
-      <w:r>
-        <w:rPr>
-          <w:rFonts w:ascii="Calibri" w:hAnsi="Calibri" w:cs="Calibri"/>
-          <w:lang w:val="en-US"/>
-        </w:rPr>
-        <w:t>Here I’m starting the verification process of the design.</w:t>
-      </w:r>
-    </w:p>
-    <w:p>
-      <w:pPr>
+      </w:pPr>
+      <w:r>
         <w:rPr>
           <w:rFonts w:ascii="Calibri" w:hAnsi="Calibri" w:cs="Calibri"/>
           <w:b/>
@@ -9717,7 +9770,8 @@
           <w:u w:val="single"/>
           <w:lang w:val="en-US"/>
         </w:rPr>
-      </w:pPr>
+        <w:t xml:space="preserve">Add </w:t>
+      </w:r>
       <w:r>
         <w:rPr>
           <w:rFonts w:ascii="Calibri" w:hAnsi="Calibri" w:cs="Calibri"/>
@@ -9726,6 +9780,1456 @@
           <w:u w:val="single"/>
           <w:lang w:val="en-US"/>
         </w:rPr>
+        <w:t xml:space="preserve">0000 </w:t>
+      </w:r>
+      <w:r>
+        <w:rPr>
+          <w:rFonts w:ascii="Calibri" w:hAnsi="Calibri" w:cs="Calibri"/>
+          <w:b/>
+          <w:bCs/>
+          <w:u w:val="single"/>
+          <w:lang w:val="en-US"/>
+        </w:rPr>
+        <w:t xml:space="preserve">and </w:t>
+      </w:r>
+      <w:proofErr w:type="gramStart"/>
+      <w:r>
+        <w:rPr>
+          <w:rFonts w:ascii="Calibri" w:hAnsi="Calibri" w:cs="Calibri"/>
+          <w:b/>
+          <w:bCs/>
+          <w:u w:val="single"/>
+          <w:lang w:val="en-US"/>
+        </w:rPr>
+        <w:t>sub</w:t>
+      </w:r>
+      <w:r>
+        <w:rPr>
+          <w:rFonts w:ascii="Calibri" w:hAnsi="Calibri" w:cs="Calibri"/>
+          <w:b/>
+          <w:bCs/>
+          <w:u w:val="single"/>
+          <w:lang w:val="en-US"/>
+        </w:rPr>
+        <w:t xml:space="preserve"> 0001</w:t>
+      </w:r>
+      <w:proofErr w:type="gramEnd"/>
+    </w:p>
+    <w:p>
+      <w:pPr>
+        <w:rPr>
+          <w:rFonts w:ascii="Calibri" w:hAnsi="Calibri" w:cs="Calibri"/>
+          <w:lang w:val="en-US"/>
+        </w:rPr>
+      </w:pPr>
+      <w:r>
+        <w:rPr>
+          <w:rFonts w:ascii="Calibri" w:hAnsi="Calibri" w:cs="Calibri"/>
+          <w:lang w:val="en-US"/>
+        </w:rPr>
+        <w:t xml:space="preserve">Notice that </w:t>
+      </w:r>
+      <w:proofErr w:type="gramStart"/>
+      <w:r>
+        <w:rPr>
+          <w:rFonts w:ascii="Calibri" w:hAnsi="Calibri" w:cs="Calibri"/>
+          <w:lang w:val="en-US"/>
+        </w:rPr>
+        <w:t>add</w:t>
+      </w:r>
+      <w:proofErr w:type="gramEnd"/>
+      <w:r>
+        <w:rPr>
+          <w:rFonts w:ascii="Calibri" w:hAnsi="Calibri" w:cs="Calibri"/>
+          <w:lang w:val="en-US"/>
+        </w:rPr>
+        <w:t xml:space="preserve">/sub distinguished by </w:t>
+      </w:r>
+      <w:proofErr w:type="spellStart"/>
+      <w:proofErr w:type="gramStart"/>
+      <w:r>
+        <w:rPr>
+          <w:rFonts w:ascii="Calibri" w:hAnsi="Calibri" w:cs="Calibri"/>
+          <w:lang w:val="en-US"/>
+        </w:rPr>
+        <w:t>alucontrol</w:t>
+      </w:r>
+      <w:proofErr w:type="spellEnd"/>
+      <w:r>
+        <w:rPr>
+          <w:rFonts w:ascii="Calibri" w:hAnsi="Calibri" w:cs="Calibri"/>
+          <w:lang w:val="en-US"/>
+        </w:rPr>
+        <w:t>[</w:t>
+      </w:r>
+      <w:proofErr w:type="gramEnd"/>
+      <w:r>
+        <w:rPr>
+          <w:rFonts w:ascii="Calibri" w:hAnsi="Calibri" w:cs="Calibri"/>
+          <w:lang w:val="en-US"/>
+        </w:rPr>
+        <w:t>0] bit.</w:t>
+      </w:r>
+    </w:p>
+    <w:p>
+      <w:pPr>
+        <w:rPr>
+          <w:rFonts w:ascii="Calibri" w:hAnsi="Calibri" w:cs="Calibri"/>
+          <w:lang w:val="en-US"/>
+        </w:rPr>
+      </w:pPr>
+      <w:r>
+        <w:rPr>
+          <w:rFonts w:ascii="Calibri" w:hAnsi="Calibri" w:cs="Calibri"/>
+          <w:lang w:val="en-US"/>
+        </w:rPr>
+        <w:t xml:space="preserve">Sub is </w:t>
+      </w:r>
+      <w:proofErr w:type="gramStart"/>
+      <w:r>
+        <w:rPr>
+          <w:rFonts w:ascii="Calibri" w:hAnsi="Calibri" w:cs="Calibri"/>
+          <w:lang w:val="en-US"/>
+        </w:rPr>
+        <w:t>add</w:t>
+      </w:r>
+      <w:proofErr w:type="gramEnd"/>
+      <w:r>
+        <w:rPr>
+          <w:rFonts w:ascii="Calibri" w:hAnsi="Calibri" w:cs="Calibri"/>
+          <w:lang w:val="en-US"/>
+        </w:rPr>
+        <w:t xml:space="preserve"> with </w:t>
+      </w:r>
+      <w:r>
+        <w:rPr>
+          <w:rFonts w:ascii="Calibri" w:hAnsi="Calibri" w:cs="Calibri"/>
+          <w:lang w:val="en-US"/>
+        </w:rPr>
+        <w:t>complement</w:t>
+      </w:r>
+      <w:r>
+        <w:rPr>
+          <w:rFonts w:ascii="Calibri" w:hAnsi="Calibri" w:cs="Calibri"/>
+          <w:lang w:val="en-US"/>
+        </w:rPr>
+        <w:t xml:space="preserve"> 2 of b.</w:t>
+      </w:r>
+    </w:p>
+    <w:p>
+      <w:pPr>
+        <w:rPr>
+          <w:rFonts w:ascii="Calibri" w:hAnsi="Calibri" w:cs="Calibri"/>
+          <w:b/>
+          <w:bCs/>
+          <w:lang w:val="en-US"/>
+        </w:rPr>
+      </w:pPr>
+      <w:r>
+        <w:rPr>
+          <w:rFonts w:ascii="Calibri" w:hAnsi="Calibri" w:cs="Calibri"/>
+          <w:b/>
+          <w:bCs/>
+          <w:lang w:val="en-US"/>
+        </w:rPr>
+        <w:t>Problem #1 – Carry lead to overflow.</w:t>
+      </w:r>
+    </w:p>
+    <w:p>
+      <w:pPr>
+        <w:rPr>
+          <w:rFonts w:ascii="Calibri" w:eastAsiaTheme="minorEastAsia" w:hAnsi="Calibri" w:cs="Calibri"/>
+          <w:rtl/>
+          <w:lang w:val="en-US"/>
+        </w:rPr>
+      </w:pPr>
+      <w:r>
+        <w:rPr>
+          <w:rFonts w:ascii="Calibri" w:hAnsi="Calibri" w:cs="Calibri"/>
+          <w:lang w:val="en-US"/>
+        </w:rPr>
+        <w:t xml:space="preserve">Max = </w:t>
+      </w:r>
+      <m:oMath>
+        <m:sSup>
+          <m:sSupPr>
+            <m:ctrlPr>
+              <w:rPr>
+                <w:rFonts w:ascii="Cambria Math" w:hAnsi="Cambria Math" w:cs="Calibri"/>
+                <w:i/>
+                <w:lang w:val="en-US"/>
+              </w:rPr>
+            </m:ctrlPr>
+          </m:sSupPr>
+          <m:e>
+            <m:r>
+              <w:rPr>
+                <w:rFonts w:ascii="Cambria Math" w:hAnsi="Cambria Math" w:cs="Calibri"/>
+                <w:lang w:val="en-US"/>
+              </w:rPr>
+              <m:t>2</m:t>
+            </m:r>
+          </m:e>
+          <m:sup>
+            <m:r>
+              <w:rPr>
+                <w:rFonts w:ascii="Cambria Math" w:hAnsi="Cambria Math" w:cs="Calibri"/>
+                <w:lang w:val="en-US"/>
+              </w:rPr>
+              <m:t>31</m:t>
+            </m:r>
+          </m:sup>
+        </m:sSup>
+        <m:r>
+          <w:rPr>
+            <w:rFonts w:ascii="Cambria Math" w:hAnsi="Cambria Math" w:cs="Calibri"/>
+            <w:lang w:val="en-US"/>
+          </w:rPr>
+          <m:t>- 1</m:t>
+        </m:r>
+        <m:r>
+          <w:rPr>
+            <w:rFonts w:ascii="Cambria Math" w:eastAsiaTheme="minorEastAsia" w:hAnsi="Cambria Math" w:cs="Calibri"/>
+            <w:lang w:val="en-US"/>
+          </w:rPr>
+          <m:t xml:space="preserve"> , </m:t>
+        </m:r>
+      </m:oMath>
+      <w:r>
+        <w:rPr>
+          <w:rFonts w:ascii="Calibri" w:hAnsi="Calibri" w:cs="Calibri"/>
+          <w:lang w:val="en-US"/>
+        </w:rPr>
+        <w:t>M</w:t>
+      </w:r>
+      <w:r>
+        <w:rPr>
+          <w:rFonts w:ascii="Calibri" w:hAnsi="Calibri" w:cs="Calibri"/>
+          <w:lang w:val="en-US"/>
+        </w:rPr>
+        <w:t xml:space="preserve">in = </w:t>
+      </w:r>
+      <m:oMath>
+        <m:r>
+          <w:rPr>
+            <w:rFonts w:ascii="Cambria Math" w:hAnsi="Cambria Math" w:cs="Calibri"/>
+            <w:lang w:val="en-US"/>
+          </w:rPr>
+          <m:t>-</m:t>
+        </m:r>
+        <m:sSup>
+          <m:sSupPr>
+            <m:ctrlPr>
+              <w:rPr>
+                <w:rFonts w:ascii="Cambria Math" w:hAnsi="Cambria Math" w:cs="Calibri"/>
+                <w:i/>
+                <w:lang w:val="en-US"/>
+              </w:rPr>
+            </m:ctrlPr>
+          </m:sSupPr>
+          <m:e>
+            <m:r>
+              <w:rPr>
+                <w:rFonts w:ascii="Cambria Math" w:hAnsi="Cambria Math" w:cs="Calibri"/>
+                <w:lang w:val="en-US"/>
+              </w:rPr>
+              <m:t>2</m:t>
+            </m:r>
+          </m:e>
+          <m:sup>
+            <m:r>
+              <w:rPr>
+                <w:rFonts w:ascii="Cambria Math" w:hAnsi="Cambria Math" w:cs="Calibri"/>
+                <w:lang w:val="en-US"/>
+              </w:rPr>
+              <m:t>31</m:t>
+            </m:r>
+          </m:sup>
+        </m:sSup>
+      </m:oMath>
+    </w:p>
+    <w:p>
+      <w:pPr>
+        <w:rPr>
+          <w:rFonts w:ascii="Calibri" w:hAnsi="Calibri" w:cs="Calibri"/>
+          <w:lang w:val="en-US"/>
+        </w:rPr>
+      </w:pPr>
+      <w:r>
+        <w:rPr>
+          <w:rFonts w:ascii="Calibri" w:eastAsiaTheme="minorEastAsia" w:hAnsi="Calibri" w:cs="Calibri"/>
+          <w:lang w:val="en-US"/>
+        </w:rPr>
+        <w:t xml:space="preserve">Carry can happen if </w:t>
+      </w:r>
+      <w:proofErr w:type="spellStart"/>
+      <w:r>
+        <w:rPr>
+          <w:rFonts w:ascii="Calibri" w:eastAsiaTheme="minorEastAsia" w:hAnsi="Calibri" w:cs="Calibri"/>
+          <w:lang w:val="en-US"/>
+        </w:rPr>
+        <w:t>pos+pos</w:t>
+      </w:r>
+      <w:proofErr w:type="spellEnd"/>
+      <w:r>
+        <w:rPr>
+          <w:rFonts w:ascii="Calibri" w:eastAsiaTheme="minorEastAsia" w:hAnsi="Calibri" w:cs="Calibri"/>
+          <w:lang w:val="en-US"/>
+        </w:rPr>
+        <w:t xml:space="preserve"> &gt; max or neg +neg &lt;min.</w:t>
+      </w:r>
+    </w:p>
+    <w:p>
+      <w:pPr>
+        <w:rPr>
+          <w:rFonts w:ascii="Calibri" w:hAnsi="Calibri" w:cs="Calibri"/>
+          <w:rtl/>
+          <w:lang w:val="en-US"/>
+        </w:rPr>
+      </w:pPr>
+      <w:proofErr w:type="gramStart"/>
+      <w:r>
+        <w:rPr>
+          <w:rFonts w:ascii="Calibri" w:hAnsi="Calibri" w:cs="Calibri"/>
+          <w:lang w:val="en-US"/>
+        </w:rPr>
+        <w:t>Overflow</w:t>
+      </w:r>
+      <w:proofErr w:type="gramEnd"/>
+      <w:r>
+        <w:rPr>
+          <w:rFonts w:ascii="Calibri" w:hAnsi="Calibri" w:cs="Calibri"/>
+          <w:lang w:val="en-US"/>
+        </w:rPr>
+        <w:t xml:space="preserve"> </w:t>
+      </w:r>
+      <w:proofErr w:type="gramStart"/>
+      <w:r>
+        <w:rPr>
+          <w:rFonts w:ascii="Calibri" w:hAnsi="Calibri" w:cs="Calibri"/>
+          <w:lang w:val="en-US"/>
+        </w:rPr>
+        <w:t>happen</w:t>
+      </w:r>
+      <w:proofErr w:type="gramEnd"/>
+      <w:r>
+        <w:rPr>
+          <w:rFonts w:ascii="Calibri" w:hAnsi="Calibri" w:cs="Calibri"/>
+          <w:lang w:val="en-US"/>
+        </w:rPr>
+        <w:t xml:space="preserve"> </w:t>
+      </w:r>
+      <w:proofErr w:type="gramStart"/>
+      <w:r>
+        <w:rPr>
+          <w:rFonts w:ascii="Calibri" w:hAnsi="Calibri" w:cs="Calibri"/>
+          <w:lang w:val="en-US"/>
+        </w:rPr>
+        <w:t>if</w:t>
+      </w:r>
+      <w:r>
+        <w:rPr>
+          <w:rFonts w:ascii="Calibri" w:hAnsi="Calibri" w:cs="Calibri"/>
+          <w:lang w:val="en-US"/>
+        </w:rPr>
+        <w:t xml:space="preserve"> :</w:t>
+      </w:r>
+      <w:proofErr w:type="gramEnd"/>
+      <w:r>
+        <w:rPr>
+          <w:rFonts w:ascii="Calibri" w:hAnsi="Calibri" w:cs="Calibri"/>
+          <w:lang w:val="en-US"/>
+        </w:rPr>
+        <w:t xml:space="preserve"> (pos + pos </w:t>
+      </w:r>
+      <w:r>
+        <w:rPr>
+          <w:rFonts w:ascii="Calibri" w:hAnsi="Calibri" w:cs="Calibri"/>
+          <w:lang w:val="en-US"/>
+        </w:rPr>
+        <w:t>=</w:t>
+      </w:r>
+      <w:proofErr w:type="gramStart"/>
+      <w:r>
+        <w:rPr>
+          <w:rFonts w:ascii="Calibri" w:hAnsi="Calibri" w:cs="Calibri"/>
+          <w:lang w:val="en-US"/>
+        </w:rPr>
+        <w:t>neg)</w:t>
+      </w:r>
+      <w:r>
+        <w:rPr>
+          <w:rFonts w:ascii="Calibri" w:hAnsi="Calibri" w:cs="Calibri"/>
+          <w:lang w:val="en-US"/>
+        </w:rPr>
+        <w:t xml:space="preserve">   </w:t>
+      </w:r>
+      <w:proofErr w:type="gramEnd"/>
+      <w:r>
+        <w:rPr>
+          <w:rFonts w:ascii="Calibri" w:hAnsi="Calibri" w:cs="Calibri"/>
+          <w:lang w:val="en-US"/>
+        </w:rPr>
+        <w:t>or (</w:t>
+      </w:r>
+      <w:proofErr w:type="spellStart"/>
+      <w:r>
+        <w:rPr>
+          <w:rFonts w:ascii="Calibri" w:hAnsi="Calibri" w:cs="Calibri"/>
+          <w:lang w:val="en-US"/>
+        </w:rPr>
+        <w:t>neg+neg</w:t>
+      </w:r>
+      <w:proofErr w:type="spellEnd"/>
+      <w:r>
+        <w:rPr>
+          <w:rFonts w:ascii="Calibri" w:hAnsi="Calibri" w:cs="Calibri"/>
+          <w:lang w:val="en-US"/>
+        </w:rPr>
+        <w:t xml:space="preserve"> = pos)</w:t>
+      </w:r>
+    </w:p>
+    <w:p>
+      <w:pPr>
+        <w:rPr>
+          <w:rFonts w:ascii="Calibri" w:hAnsi="Calibri" w:cs="Calibri"/>
+          <w:lang w:val="en-US"/>
+        </w:rPr>
+      </w:pPr>
+      <w:r>
+        <w:rPr>
+          <w:rFonts w:ascii="Calibri" w:hAnsi="Calibri" w:cs="Calibri"/>
+          <w:lang w:val="en-US"/>
+        </w:rPr>
+        <w:t>Or for sub</w:t>
+      </w:r>
+      <w:r>
+        <w:rPr>
+          <w:rFonts w:ascii="Calibri" w:hAnsi="Calibri" w:cs="Calibri"/>
+          <w:lang w:val="en-US"/>
+        </w:rPr>
+        <w:t xml:space="preserve"> if: (pos-neg = </w:t>
+      </w:r>
+      <w:proofErr w:type="gramStart"/>
+      <w:r>
+        <w:rPr>
+          <w:rFonts w:ascii="Calibri" w:hAnsi="Calibri" w:cs="Calibri"/>
+          <w:lang w:val="en-US"/>
+        </w:rPr>
+        <w:t>neg )</w:t>
+      </w:r>
+      <w:proofErr w:type="gramEnd"/>
+      <w:r>
+        <w:rPr>
+          <w:rFonts w:ascii="Calibri" w:hAnsi="Calibri" w:cs="Calibri"/>
+          <w:lang w:val="en-US"/>
+        </w:rPr>
+        <w:t xml:space="preserve"> or (neg – pos = pos) </w:t>
+      </w:r>
+    </w:p>
+    <w:p>
+      <w:pPr>
+        <w:rPr>
+          <w:rFonts w:ascii="Calibri" w:hAnsi="Calibri" w:cs="Calibri"/>
+          <w:lang w:val="en-US"/>
+        </w:rPr>
+      </w:pPr>
+      <w:r>
+        <w:rPr>
+          <w:rFonts w:ascii="Calibri" w:hAnsi="Calibri" w:cs="Calibri"/>
+          <w:lang w:val="en-US"/>
+        </w:rPr>
+        <w:t xml:space="preserve">Let define C_in31 is the carry for addition operation that enters the 32bit last bitwise </w:t>
+      </w:r>
+      <w:proofErr w:type="gramStart"/>
+      <w:r>
+        <w:rPr>
+          <w:rFonts w:ascii="Calibri" w:hAnsi="Calibri" w:cs="Calibri"/>
+          <w:lang w:val="en-US"/>
+        </w:rPr>
+        <w:t>addition :</w:t>
+      </w:r>
+      <w:proofErr w:type="gramEnd"/>
+      <w:r>
+        <w:rPr>
+          <w:rFonts w:ascii="Calibri" w:hAnsi="Calibri" w:cs="Calibri"/>
+          <w:lang w:val="en-US"/>
+        </w:rPr>
+        <w:t xml:space="preserve"> </w:t>
+      </w:r>
+      <w:r>
+        <w:rPr>
+          <w:rFonts w:ascii="Calibri" w:hAnsi="Calibri" w:cs="Calibri"/>
+          <w:lang w:val="en-US"/>
+        </w:rPr>
+        <w:br/>
+        <w:t>{a_31+b_31+c_in</w:t>
+      </w:r>
+      <w:proofErr w:type="gramStart"/>
+      <w:r>
+        <w:rPr>
+          <w:rFonts w:ascii="Calibri" w:hAnsi="Calibri" w:cs="Calibri"/>
+          <w:lang w:val="en-US"/>
+        </w:rPr>
+        <w:t>31}=</w:t>
+      </w:r>
+      <w:proofErr w:type="gramEnd"/>
+      <w:r>
+        <w:rPr>
+          <w:rFonts w:ascii="Calibri" w:hAnsi="Calibri" w:cs="Calibri"/>
+          <w:lang w:val="en-US"/>
+        </w:rPr>
+        <w:t>{c_</w:t>
+      </w:r>
+      <w:proofErr w:type="gramStart"/>
+      <w:r>
+        <w:rPr>
+          <w:rFonts w:ascii="Calibri" w:hAnsi="Calibri" w:cs="Calibri"/>
+          <w:lang w:val="en-US"/>
+        </w:rPr>
+        <w:t>out,sum</w:t>
+      </w:r>
+      <w:proofErr w:type="gramEnd"/>
+      <w:r>
+        <w:rPr>
+          <w:rFonts w:ascii="Calibri" w:hAnsi="Calibri" w:cs="Calibri"/>
+          <w:lang w:val="en-US"/>
+        </w:rPr>
+        <w:t>_31}</w:t>
+      </w:r>
+    </w:p>
+    <w:tbl>
+      <w:tblPr>
+        <w:tblStyle w:val="TableGrid"/>
+        <w:tblW w:w="0" w:type="auto"/>
+        <w:tblLook w:val="04A0" w:firstRow="1" w:lastRow="0" w:firstColumn="1" w:lastColumn="0" w:noHBand="0" w:noVBand="1"/>
+      </w:tblPr>
+      <w:tblGrid>
+        <w:gridCol w:w="1100"/>
+        <w:gridCol w:w="1100"/>
+        <w:gridCol w:w="1100"/>
+        <w:gridCol w:w="1109"/>
+      </w:tblGrid>
+      <w:tr>
+        <w:trPr>
+          <w:trHeight w:val="262"/>
+        </w:trPr>
+        <w:tc>
+          <w:tcPr>
+            <w:tcW w:w="1100" w:type="dxa"/>
+          </w:tcPr>
+          <w:p>
+            <w:pPr>
+              <w:rPr>
+                <w:rFonts w:ascii="Calibri" w:hAnsi="Calibri" w:cs="Calibri" w:hint="cs"/>
+                <w:lang w:val="en-US"/>
+              </w:rPr>
+            </w:pPr>
+            <w:r>
+              <w:rPr>
+                <w:rFonts w:ascii="Calibri" w:hAnsi="Calibri" w:cs="Calibri"/>
+                <w:lang w:val="en-US"/>
+              </w:rPr>
+              <w:t>Cin_31</w:t>
+            </w:r>
+          </w:p>
+        </w:tc>
+        <w:tc>
+          <w:tcPr>
+            <w:tcW w:w="1100" w:type="dxa"/>
+          </w:tcPr>
+          <w:p>
+            <w:pPr>
+              <w:rPr>
+                <w:rFonts w:ascii="Calibri" w:hAnsi="Calibri" w:cs="Calibri" w:hint="cs"/>
+                <w:lang w:val="en-US"/>
+              </w:rPr>
+            </w:pPr>
+            <w:proofErr w:type="spellStart"/>
+            <w:r>
+              <w:rPr>
+                <w:rFonts w:ascii="Calibri" w:hAnsi="Calibri" w:cs="Calibri"/>
+                <w:lang w:val="en-US"/>
+              </w:rPr>
+              <w:t>C_out</w:t>
+            </w:r>
+            <w:proofErr w:type="spellEnd"/>
+          </w:p>
+        </w:tc>
+        <w:tc>
+          <w:tcPr>
+            <w:tcW w:w="1100" w:type="dxa"/>
+          </w:tcPr>
+          <w:p>
+            <w:pPr>
+              <w:rPr>
+                <w:rFonts w:ascii="Calibri" w:hAnsi="Calibri" w:cs="Calibri" w:hint="cs"/>
+                <w:lang w:val="en-US"/>
+              </w:rPr>
+            </w:pPr>
+            <w:r>
+              <w:rPr>
+                <w:rFonts w:ascii="Calibri" w:hAnsi="Calibri" w:cs="Calibri"/>
+                <w:lang w:val="en-US"/>
+              </w:rPr>
+              <w:t>Carry</w:t>
+            </w:r>
+          </w:p>
+        </w:tc>
+        <w:tc>
+          <w:tcPr>
+            <w:tcW w:w="1100" w:type="dxa"/>
+          </w:tcPr>
+          <w:p>
+            <w:pPr>
+              <w:rPr>
+                <w:rFonts w:ascii="Calibri" w:hAnsi="Calibri" w:cs="Calibri" w:hint="cs"/>
+                <w:lang w:val="en-US"/>
+              </w:rPr>
+            </w:pPr>
+            <w:r>
+              <w:rPr>
+                <w:rFonts w:ascii="Calibri" w:hAnsi="Calibri" w:cs="Calibri"/>
+                <w:lang w:val="en-US"/>
+              </w:rPr>
+              <w:t>Overflow</w:t>
+            </w:r>
+          </w:p>
+        </w:tc>
+      </w:tr>
+      <w:tr>
+        <w:trPr>
+          <w:trHeight w:val="262"/>
+        </w:trPr>
+        <w:tc>
+          <w:tcPr>
+            <w:tcW w:w="1100" w:type="dxa"/>
+          </w:tcPr>
+          <w:p>
+            <w:pPr>
+              <w:rPr>
+                <w:rFonts w:ascii="Calibri" w:hAnsi="Calibri" w:cs="Calibri" w:hint="cs"/>
+                <w:lang w:val="en-US"/>
+              </w:rPr>
+            </w:pPr>
+            <w:r>
+              <w:rPr>
+                <w:rFonts w:ascii="Calibri" w:hAnsi="Calibri" w:cs="Calibri"/>
+                <w:lang w:val="en-US"/>
+              </w:rPr>
+              <w:t>0</w:t>
+            </w:r>
+          </w:p>
+        </w:tc>
+        <w:tc>
+          <w:tcPr>
+            <w:tcW w:w="1100" w:type="dxa"/>
+          </w:tcPr>
+          <w:p>
+            <w:pPr>
+              <w:rPr>
+                <w:rFonts w:ascii="Calibri" w:hAnsi="Calibri" w:cs="Calibri" w:hint="cs"/>
+                <w:lang w:val="en-US"/>
+              </w:rPr>
+            </w:pPr>
+            <w:r>
+              <w:rPr>
+                <w:rFonts w:ascii="Calibri" w:hAnsi="Calibri" w:cs="Calibri"/>
+                <w:lang w:val="en-US"/>
+              </w:rPr>
+              <w:t>0</w:t>
+            </w:r>
+          </w:p>
+        </w:tc>
+        <w:tc>
+          <w:tcPr>
+            <w:tcW w:w="1100" w:type="dxa"/>
+          </w:tcPr>
+          <w:p>
+            <w:pPr>
+              <w:rPr>
+                <w:rFonts w:ascii="Calibri" w:hAnsi="Calibri" w:cs="Calibri" w:hint="cs"/>
+                <w:lang w:val="en-US"/>
+              </w:rPr>
+            </w:pPr>
+            <w:r>
+              <w:rPr>
+                <w:rFonts w:ascii="Calibri" w:hAnsi="Calibri" w:cs="Calibri"/>
+                <w:lang w:val="en-US"/>
+              </w:rPr>
+              <w:t>0</w:t>
+            </w:r>
+          </w:p>
+        </w:tc>
+        <w:tc>
+          <w:tcPr>
+            <w:tcW w:w="1100" w:type="dxa"/>
+          </w:tcPr>
+          <w:p>
+            <w:pPr>
+              <w:rPr>
+                <w:rFonts w:ascii="Calibri" w:hAnsi="Calibri" w:cs="Calibri" w:hint="cs"/>
+                <w:lang w:val="en-US"/>
+              </w:rPr>
+            </w:pPr>
+            <w:r>
+              <w:rPr>
+                <w:rFonts w:ascii="Calibri" w:hAnsi="Calibri" w:cs="Calibri"/>
+                <w:lang w:val="en-US"/>
+              </w:rPr>
+              <w:t>0</w:t>
+            </w:r>
+          </w:p>
+        </w:tc>
+      </w:tr>
+      <w:tr>
+        <w:trPr>
+          <w:trHeight w:val="270"/>
+        </w:trPr>
+        <w:tc>
+          <w:tcPr>
+            <w:tcW w:w="1100" w:type="dxa"/>
+          </w:tcPr>
+          <w:p>
+            <w:pPr>
+              <w:rPr>
+                <w:rFonts w:ascii="Calibri" w:hAnsi="Calibri" w:cs="Calibri" w:hint="cs"/>
+                <w:lang w:val="en-US"/>
+              </w:rPr>
+            </w:pPr>
+            <w:r>
+              <w:rPr>
+                <w:rFonts w:ascii="Calibri" w:hAnsi="Calibri" w:cs="Calibri"/>
+                <w:lang w:val="en-US"/>
+              </w:rPr>
+              <w:t>0</w:t>
+            </w:r>
+          </w:p>
+        </w:tc>
+        <w:tc>
+          <w:tcPr>
+            <w:tcW w:w="1100" w:type="dxa"/>
+          </w:tcPr>
+          <w:p>
+            <w:pPr>
+              <w:rPr>
+                <w:rFonts w:ascii="Calibri" w:hAnsi="Calibri" w:cs="Calibri" w:hint="cs"/>
+                <w:lang w:val="en-US"/>
+              </w:rPr>
+            </w:pPr>
+            <w:r>
+              <w:rPr>
+                <w:rFonts w:ascii="Calibri" w:hAnsi="Calibri" w:cs="Calibri"/>
+                <w:lang w:val="en-US"/>
+              </w:rPr>
+              <w:t>1</w:t>
+            </w:r>
+          </w:p>
+        </w:tc>
+        <w:tc>
+          <w:tcPr>
+            <w:tcW w:w="1100" w:type="dxa"/>
+          </w:tcPr>
+          <w:p>
+            <w:pPr>
+              <w:rPr>
+                <w:rFonts w:ascii="Calibri" w:hAnsi="Calibri" w:cs="Calibri"/>
+                <w:lang w:val="en-US"/>
+              </w:rPr>
+            </w:pPr>
+          </w:p>
+        </w:tc>
+        <w:tc>
+          <w:tcPr>
+            <w:tcW w:w="1100" w:type="dxa"/>
+          </w:tcPr>
+          <w:p>
+            <w:pPr>
+              <w:rPr>
+                <w:rFonts w:ascii="Calibri" w:hAnsi="Calibri" w:cs="Calibri" w:hint="cs"/>
+                <w:lang w:val="en-US"/>
+              </w:rPr>
+            </w:pPr>
+          </w:p>
+        </w:tc>
+      </w:tr>
+      <w:tr>
+        <w:trPr>
+          <w:trHeight w:val="262"/>
+        </w:trPr>
+        <w:tc>
+          <w:tcPr>
+            <w:tcW w:w="1100" w:type="dxa"/>
+          </w:tcPr>
+          <w:p>
+            <w:pPr>
+              <w:rPr>
+                <w:rFonts w:ascii="Calibri" w:hAnsi="Calibri" w:cs="Calibri" w:hint="cs"/>
+                <w:lang w:val="en-US"/>
+              </w:rPr>
+            </w:pPr>
+            <w:r>
+              <w:rPr>
+                <w:rFonts w:ascii="Calibri" w:hAnsi="Calibri" w:cs="Calibri"/>
+                <w:lang w:val="en-US"/>
+              </w:rPr>
+              <w:t>1</w:t>
+            </w:r>
+          </w:p>
+        </w:tc>
+        <w:tc>
+          <w:tcPr>
+            <w:tcW w:w="1100" w:type="dxa"/>
+          </w:tcPr>
+          <w:p>
+            <w:pPr>
+              <w:rPr>
+                <w:rFonts w:ascii="Calibri" w:hAnsi="Calibri" w:cs="Calibri" w:hint="cs"/>
+                <w:lang w:val="en-US"/>
+              </w:rPr>
+            </w:pPr>
+            <w:r>
+              <w:rPr>
+                <w:rFonts w:ascii="Calibri" w:hAnsi="Calibri" w:cs="Calibri"/>
+                <w:lang w:val="en-US"/>
+              </w:rPr>
+              <w:t>0</w:t>
+            </w:r>
+          </w:p>
+        </w:tc>
+        <w:tc>
+          <w:tcPr>
+            <w:tcW w:w="1100" w:type="dxa"/>
+          </w:tcPr>
+          <w:p>
+            <w:pPr>
+              <w:rPr>
+                <w:rFonts w:ascii="Calibri" w:hAnsi="Calibri" w:cs="Calibri" w:hint="cs"/>
+                <w:lang w:val="en-US"/>
+              </w:rPr>
+            </w:pPr>
+          </w:p>
+        </w:tc>
+        <w:tc>
+          <w:tcPr>
+            <w:tcW w:w="1100" w:type="dxa"/>
+          </w:tcPr>
+          <w:p>
+            <w:pPr>
+              <w:rPr>
+                <w:rFonts w:ascii="Calibri" w:hAnsi="Calibri" w:cs="Calibri" w:hint="cs"/>
+                <w:lang w:val="en-US"/>
+              </w:rPr>
+            </w:pPr>
+          </w:p>
+        </w:tc>
+      </w:tr>
+      <w:tr>
+        <w:trPr>
+          <w:trHeight w:val="262"/>
+        </w:trPr>
+        <w:tc>
+          <w:tcPr>
+            <w:tcW w:w="1100" w:type="dxa"/>
+          </w:tcPr>
+          <w:p>
+            <w:pPr>
+              <w:rPr>
+                <w:rFonts w:ascii="Calibri" w:hAnsi="Calibri" w:cs="Calibri" w:hint="cs"/>
+                <w:lang w:val="en-US"/>
+              </w:rPr>
+            </w:pPr>
+            <w:r>
+              <w:rPr>
+                <w:rFonts w:ascii="Calibri" w:hAnsi="Calibri" w:cs="Calibri"/>
+                <w:lang w:val="en-US"/>
+              </w:rPr>
+              <w:t>1</w:t>
+            </w:r>
+          </w:p>
+        </w:tc>
+        <w:tc>
+          <w:tcPr>
+            <w:tcW w:w="1100" w:type="dxa"/>
+          </w:tcPr>
+          <w:p>
+            <w:pPr>
+              <w:rPr>
+                <w:rFonts w:ascii="Calibri" w:hAnsi="Calibri" w:cs="Calibri" w:hint="cs"/>
+                <w:lang w:val="en-US"/>
+              </w:rPr>
+            </w:pPr>
+            <w:r>
+              <w:rPr>
+                <w:rFonts w:ascii="Calibri" w:hAnsi="Calibri" w:cs="Calibri"/>
+                <w:lang w:val="en-US"/>
+              </w:rPr>
+              <w:t>1</w:t>
+            </w:r>
+          </w:p>
+        </w:tc>
+        <w:tc>
+          <w:tcPr>
+            <w:tcW w:w="1100" w:type="dxa"/>
+          </w:tcPr>
+          <w:p>
+            <w:pPr>
+              <w:rPr>
+                <w:rFonts w:ascii="Calibri" w:hAnsi="Calibri" w:cs="Calibri" w:hint="cs"/>
+                <w:lang w:val="en-US"/>
+              </w:rPr>
+            </w:pPr>
+          </w:p>
+        </w:tc>
+        <w:tc>
+          <w:tcPr>
+            <w:tcW w:w="1100" w:type="dxa"/>
+          </w:tcPr>
+          <w:p>
+            <w:pPr>
+              <w:rPr>
+                <w:rFonts w:ascii="Calibri" w:hAnsi="Calibri" w:cs="Calibri" w:hint="cs"/>
+                <w:lang w:val="en-US"/>
+              </w:rPr>
+            </w:pPr>
+          </w:p>
+        </w:tc>
+      </w:tr>
+    </w:tbl>
+    <w:p>
+      <w:pPr>
+        <w:rPr>
+          <w:rFonts w:ascii="Calibri" w:hAnsi="Calibri" w:cs="Calibri"/>
+          <w:lang w:val="en-US"/>
+        </w:rPr>
+      </w:pPr>
+    </w:p>
+    <w:p>
+      <w:pPr>
+        <w:rPr>
+          <w:rFonts w:ascii="Calibri" w:hAnsi="Calibri" w:cs="Calibri"/>
+          <w:lang w:val="en-US"/>
+        </w:rPr>
+      </w:pPr>
+    </w:p>
+    <w:p>
+      <w:pPr>
+        <w:rPr>
+          <w:rFonts w:ascii="Calibri" w:hAnsi="Calibri" w:cs="Calibri"/>
+          <w:lang w:val="en-US"/>
+        </w:rPr>
+      </w:pPr>
+      <w:r>
+        <w:rPr>
+          <w:rFonts w:ascii="Calibri" w:hAnsi="Calibri" w:cs="Calibri"/>
+          <w:lang w:val="en-US"/>
+        </w:rPr>
+        <w:t xml:space="preserve">I </w:t>
+      </w:r>
+      <w:proofErr w:type="spellStart"/>
+      <w:proofErr w:type="gramStart"/>
+      <w:r>
+        <w:rPr>
+          <w:rFonts w:ascii="Calibri" w:hAnsi="Calibri" w:cs="Calibri"/>
+          <w:lang w:val="en-US"/>
+        </w:rPr>
+        <w:t>cant</w:t>
+      </w:r>
+      <w:proofErr w:type="spellEnd"/>
+      <w:proofErr w:type="gramEnd"/>
+      <w:r>
+        <w:rPr>
+          <w:rFonts w:ascii="Calibri" w:hAnsi="Calibri" w:cs="Calibri"/>
+          <w:lang w:val="en-US"/>
+        </w:rPr>
+        <w:t xml:space="preserve"> let the output be more than 32 </w:t>
+      </w:r>
+      <w:proofErr w:type="gramStart"/>
+      <w:r>
+        <w:rPr>
+          <w:rFonts w:ascii="Calibri" w:hAnsi="Calibri" w:cs="Calibri"/>
+          <w:lang w:val="en-US"/>
+        </w:rPr>
+        <w:t>bit</w:t>
+      </w:r>
+      <w:proofErr w:type="gramEnd"/>
+      <w:r>
+        <w:rPr>
+          <w:rFonts w:ascii="Calibri" w:hAnsi="Calibri" w:cs="Calibri"/>
+          <w:lang w:val="en-US"/>
+        </w:rPr>
+        <w:t>.</w:t>
+      </w:r>
+    </w:p>
+    <w:p>
+      <w:pPr>
+        <w:rPr>
+          <w:rFonts w:ascii="Calibri" w:hAnsi="Calibri" w:cs="Calibri"/>
+          <w:b/>
+          <w:bCs/>
+          <w:lang w:val="en-US"/>
+        </w:rPr>
+      </w:pPr>
+      <w:r>
+        <w:rPr>
+          <w:rFonts w:ascii="Calibri" w:hAnsi="Calibri" w:cs="Calibri"/>
+          <w:b/>
+          <w:bCs/>
+          <w:lang w:val="en-US"/>
+        </w:rPr>
+        <w:t xml:space="preserve">Solution: </w:t>
+      </w:r>
+    </w:p>
+    <w:p>
+      <w:pPr>
+        <w:rPr>
+          <w:rFonts w:ascii="Calibri" w:hAnsi="Calibri" w:cs="Calibri"/>
+          <w:u w:val="single"/>
+          <w:lang w:val="en-US"/>
+        </w:rPr>
+      </w:pPr>
+      <w:r>
+        <w:rPr>
+          <w:rFonts w:ascii="Calibri" w:hAnsi="Calibri" w:cs="Calibri"/>
+          <w:u w:val="single"/>
+          <w:lang w:val="en-US"/>
+        </w:rPr>
+        <w:t>Step 1: carry detection</w:t>
+      </w:r>
+    </w:p>
+    <w:p>
+      <w:pPr>
+        <w:rPr>
+          <w:rFonts w:ascii="Calibri" w:hAnsi="Calibri" w:cs="Calibri"/>
+          <w:lang w:val="en-US"/>
+        </w:rPr>
+      </w:pPr>
+      <w:r>
+        <w:rPr>
+          <w:rFonts w:ascii="Calibri" w:hAnsi="Calibri" w:cs="Calibri"/>
+          <w:lang w:val="en-US"/>
+        </w:rPr>
+        <w:lastRenderedPageBreak/>
+        <w:t xml:space="preserve">Create aggregated 33-bit version of the input values and </w:t>
+      </w:r>
+      <w:proofErr w:type="gramStart"/>
+      <w:r>
+        <w:rPr>
+          <w:rFonts w:ascii="Calibri" w:hAnsi="Calibri" w:cs="Calibri"/>
+          <w:lang w:val="en-US"/>
+        </w:rPr>
+        <w:t>sum :</w:t>
+      </w:r>
+      <w:proofErr w:type="gramEnd"/>
+    </w:p>
+    <w:p>
+      <w:pPr>
+        <w:rPr>
+          <w:rFonts w:ascii="Calibri" w:hAnsi="Calibri" w:cs="Calibri"/>
+          <w:lang w:val="en-US"/>
+        </w:rPr>
+      </w:pPr>
+      <w:proofErr w:type="spellStart"/>
+      <w:r>
+        <w:rPr>
+          <w:rFonts w:ascii="Calibri" w:hAnsi="Calibri" w:cs="Calibri"/>
+          <w:lang w:val="en-US"/>
+        </w:rPr>
+        <w:t>Sum_agg</w:t>
+      </w:r>
+      <w:proofErr w:type="spellEnd"/>
+      <w:r>
+        <w:rPr>
+          <w:rFonts w:ascii="Calibri" w:hAnsi="Calibri" w:cs="Calibri"/>
+          <w:lang w:val="en-US"/>
+        </w:rPr>
+        <w:t xml:space="preserve"> [32:0] = [</w:t>
+      </w:r>
+      <w:proofErr w:type="gramStart"/>
+      <w:r>
+        <w:rPr>
+          <w:rFonts w:ascii="Calibri" w:hAnsi="Calibri" w:cs="Calibri"/>
+          <w:lang w:val="en-US"/>
+        </w:rPr>
+        <w:t>0,a</w:t>
+      </w:r>
+      <w:proofErr w:type="gramEnd"/>
+      <w:r>
+        <w:rPr>
+          <w:rFonts w:ascii="Calibri" w:hAnsi="Calibri" w:cs="Calibri"/>
+          <w:lang w:val="en-US"/>
+        </w:rPr>
+        <w:t>] +[0b] = [</w:t>
+      </w:r>
+      <w:proofErr w:type="spellStart"/>
+      <w:r>
+        <w:rPr>
+          <w:rFonts w:ascii="Calibri" w:hAnsi="Calibri" w:cs="Calibri"/>
+          <w:lang w:val="en-US"/>
+        </w:rPr>
+        <w:t>a+b</w:t>
+      </w:r>
+      <w:proofErr w:type="spellEnd"/>
+      <w:r>
+        <w:rPr>
+          <w:rFonts w:ascii="Calibri" w:hAnsi="Calibri" w:cs="Calibri"/>
+          <w:lang w:val="en-US"/>
+        </w:rPr>
+        <w:t xml:space="preserve">] </w:t>
+      </w:r>
+    </w:p>
+    <w:p>
+      <w:pPr>
+        <w:rPr>
+          <w:rFonts w:ascii="Calibri" w:hAnsi="Calibri" w:cs="Calibri"/>
+          <w:lang w:val="en-US"/>
+        </w:rPr>
+      </w:pPr>
+      <w:r>
+        <w:rPr>
+          <w:rFonts w:ascii="Calibri" w:hAnsi="Calibri" w:cs="Calibri"/>
+          <w:lang w:val="en-US"/>
+        </w:rPr>
+        <w:t xml:space="preserve">Sum = </w:t>
+      </w:r>
+      <w:proofErr w:type="spellStart"/>
+      <w:r>
+        <w:rPr>
+          <w:rFonts w:ascii="Calibri" w:hAnsi="Calibri" w:cs="Calibri"/>
+          <w:lang w:val="en-US"/>
+        </w:rPr>
+        <w:t>sum_agg</w:t>
+      </w:r>
+      <w:proofErr w:type="spellEnd"/>
+      <w:r>
+        <w:rPr>
+          <w:rFonts w:ascii="Calibri" w:hAnsi="Calibri" w:cs="Calibri"/>
+          <w:lang w:val="en-US"/>
+        </w:rPr>
+        <w:t xml:space="preserve"> [31:0]</w:t>
+      </w:r>
+    </w:p>
+    <w:p>
+      <w:pPr>
+        <w:rPr>
+          <w:rFonts w:ascii="Calibri" w:hAnsi="Calibri" w:cs="Calibri"/>
+          <w:lang w:val="en-US"/>
+        </w:rPr>
+      </w:pPr>
+      <w:r>
+        <w:rPr>
+          <w:rFonts w:ascii="Calibri" w:hAnsi="Calibri" w:cs="Calibri"/>
+          <w:lang w:val="en-US"/>
+        </w:rPr>
+        <w:t xml:space="preserve">Carry out = </w:t>
+      </w:r>
+      <w:proofErr w:type="spellStart"/>
+      <w:r>
+        <w:rPr>
+          <w:rFonts w:ascii="Calibri" w:hAnsi="Calibri" w:cs="Calibri"/>
+          <w:lang w:val="en-US"/>
+        </w:rPr>
+        <w:t>sum_</w:t>
+      </w:r>
+      <w:proofErr w:type="gramStart"/>
+      <w:r>
+        <w:rPr>
+          <w:rFonts w:ascii="Calibri" w:hAnsi="Calibri" w:cs="Calibri"/>
+          <w:lang w:val="en-US"/>
+        </w:rPr>
+        <w:t>agg</w:t>
+      </w:r>
+      <w:proofErr w:type="spellEnd"/>
+      <w:r>
+        <w:rPr>
+          <w:rFonts w:ascii="Calibri" w:hAnsi="Calibri" w:cs="Calibri"/>
+          <w:lang w:val="en-US"/>
+        </w:rPr>
+        <w:t>[</w:t>
+      </w:r>
+      <w:proofErr w:type="gramEnd"/>
+      <w:r>
+        <w:rPr>
+          <w:rFonts w:ascii="Calibri" w:hAnsi="Calibri" w:cs="Calibri"/>
+          <w:lang w:val="en-US"/>
+        </w:rPr>
+        <w:t>32]</w:t>
+      </w:r>
+    </w:p>
+    <w:p>
+      <w:pPr>
+        <w:rPr>
+          <w:rFonts w:ascii="Calibri" w:hAnsi="Calibri" w:cs="Calibri"/>
+          <w:lang w:val="en-US"/>
+        </w:rPr>
+      </w:pPr>
+    </w:p>
+    <w:p>
+      <w:pPr>
+        <w:rPr>
+          <w:rFonts w:ascii="Calibri" w:hAnsi="Calibri" w:cs="Calibri"/>
+          <w:lang w:val="en-US"/>
+        </w:rPr>
+      </w:pPr>
+    </w:p>
+    <w:p>
+      <w:pPr>
+        <w:rPr>
+          <w:rFonts w:ascii="Calibri" w:hAnsi="Calibri" w:cs="Calibri"/>
+          <w:lang w:val="en-US"/>
+        </w:rPr>
+      </w:pPr>
+    </w:p>
+    <w:p>
+      <w:pPr>
+        <w:rPr>
+          <w:rFonts w:ascii="Calibri" w:hAnsi="Calibri" w:cs="Calibri"/>
+          <w:lang w:val="en-US"/>
+        </w:rPr>
+      </w:pPr>
+    </w:p>
+    <w:p>
+      <w:pPr>
+        <w:rPr>
+          <w:rFonts w:ascii="Calibri" w:hAnsi="Calibri" w:cs="Calibri"/>
+          <w:lang w:val="en-US"/>
+        </w:rPr>
+      </w:pPr>
+    </w:p>
+    <w:p>
+      <w:pPr>
+        <w:rPr>
+          <w:rFonts w:ascii="Calibri" w:hAnsi="Calibri" w:cs="Calibri"/>
+          <w:lang w:val="en-US"/>
+        </w:rPr>
+      </w:pPr>
+    </w:p>
+    <w:p>
+      <w:pPr>
+        <w:rPr>
+          <w:rFonts w:ascii="Calibri" w:hAnsi="Calibri" w:cs="Calibri"/>
+          <w:lang w:val="en-US"/>
+        </w:rPr>
+      </w:pPr>
+    </w:p>
+    <w:p>
+      <w:pPr>
+        <w:rPr>
+          <w:rFonts w:ascii="Calibri" w:hAnsi="Calibri" w:cs="Calibri"/>
+          <w:lang w:val="en-US"/>
+        </w:rPr>
+      </w:pPr>
+    </w:p>
+    <w:p>
+      <w:pPr>
+        <w:rPr>
+          <w:rFonts w:ascii="Calibri" w:hAnsi="Calibri" w:cs="Calibri"/>
+          <w:lang w:val="en-US"/>
+        </w:rPr>
+      </w:pPr>
+    </w:p>
+    <w:p>
+      <w:pPr>
+        <w:rPr>
+          <w:rFonts w:ascii="Calibri" w:hAnsi="Calibri" w:cs="Calibri"/>
+          <w:lang w:val="en-US"/>
+        </w:rPr>
+      </w:pPr>
+    </w:p>
+    <w:p>
+      <w:pPr>
+        <w:rPr>
+          <w:rFonts w:ascii="Calibri" w:hAnsi="Calibri" w:cs="Calibri"/>
+          <w:lang w:val="en-US"/>
+        </w:rPr>
+      </w:pPr>
+    </w:p>
+    <w:p>
+      <w:pPr>
+        <w:rPr>
+          <w:rFonts w:ascii="Calibri" w:hAnsi="Calibri" w:cs="Calibri"/>
+          <w:lang w:val="en-US"/>
+        </w:rPr>
+      </w:pPr>
+    </w:p>
+    <w:p>
+      <w:pPr>
+        <w:rPr>
+          <w:rFonts w:ascii="Calibri" w:hAnsi="Calibri" w:cs="Calibri"/>
+          <w:lang w:val="en-US"/>
+        </w:rPr>
+      </w:pPr>
+    </w:p>
+    <w:p>
+      <w:pPr>
+        <w:rPr>
+          <w:rFonts w:ascii="Calibri" w:hAnsi="Calibri" w:cs="Calibri"/>
+          <w:lang w:val="en-US"/>
+        </w:rPr>
+      </w:pPr>
+    </w:p>
+    <w:p>
+      <w:pPr>
+        <w:rPr>
+          <w:rFonts w:ascii="Calibri" w:hAnsi="Calibri" w:cs="Calibri"/>
+          <w:lang w:val="en-US"/>
+        </w:rPr>
+      </w:pPr>
+    </w:p>
+    <w:p>
+      <w:pPr>
+        <w:rPr>
+          <w:rFonts w:ascii="Calibri" w:hAnsi="Calibri" w:cs="Calibri"/>
+          <w:lang w:val="en-US"/>
+        </w:rPr>
+      </w:pPr>
+    </w:p>
+    <w:p>
+      <w:pPr>
+        <w:rPr>
+          <w:rFonts w:ascii="Calibri" w:hAnsi="Calibri" w:cs="Calibri"/>
+          <w:lang w:val="en-US"/>
+        </w:rPr>
+      </w:pPr>
+    </w:p>
+    <w:p>
+      <w:pPr>
+        <w:rPr>
+          <w:rFonts w:ascii="Calibri" w:hAnsi="Calibri" w:cs="Calibri"/>
+          <w:lang w:val="en-US"/>
+        </w:rPr>
+      </w:pPr>
+    </w:p>
+    <w:p>
+      <w:pPr>
+        <w:rPr>
+          <w:rFonts w:ascii="Calibri" w:hAnsi="Calibri" w:cs="Calibri"/>
+          <w:lang w:val="en-US"/>
+        </w:rPr>
+      </w:pPr>
+    </w:p>
+    <w:p>
+      <w:pPr>
+        <w:rPr>
+          <w:rFonts w:ascii="Calibri" w:hAnsi="Calibri" w:cs="Calibri"/>
+          <w:lang w:val="en-US"/>
+        </w:rPr>
+      </w:pPr>
+    </w:p>
+    <w:p>
+      <w:pPr>
+        <w:rPr>
+          <w:rFonts w:ascii="Calibri" w:hAnsi="Calibri" w:cs="Calibri"/>
+          <w:lang w:val="en-US"/>
+        </w:rPr>
+      </w:pPr>
+    </w:p>
+    <w:p>
+      <w:pPr>
+        <w:rPr>
+          <w:rFonts w:ascii="Calibri" w:hAnsi="Calibri" w:cs="Calibri"/>
+          <w:lang w:val="en-US"/>
+        </w:rPr>
+      </w:pPr>
+    </w:p>
+    <w:p>
+      <w:pPr>
+        <w:rPr>
+          <w:rFonts w:ascii="Calibri" w:hAnsi="Calibri" w:cs="Calibri"/>
+          <w:lang w:val="en-US"/>
+        </w:rPr>
+      </w:pPr>
+    </w:p>
+    <w:p>
+      <w:pPr>
+        <w:rPr>
+          <w:rFonts w:ascii="Calibri" w:hAnsi="Calibri" w:cs="Calibri"/>
+          <w:lang w:val="en-US"/>
+        </w:rPr>
+      </w:pPr>
+    </w:p>
+    <w:p>
+      <w:pPr>
+        <w:rPr>
+          <w:rFonts w:ascii="Calibri" w:hAnsi="Calibri" w:cs="Calibri"/>
+          <w:lang w:val="en-US"/>
+        </w:rPr>
+      </w:pPr>
+    </w:p>
+    <w:p>
+      <w:pPr>
+        <w:rPr>
+          <w:rFonts w:ascii="Calibri" w:hAnsi="Calibri" w:cs="Calibri"/>
+          <w:lang w:val="en-US"/>
+        </w:rPr>
+      </w:pPr>
+    </w:p>
+    <w:p>
+      <w:pPr>
+        <w:rPr>
+          <w:rFonts w:ascii="Calibri" w:hAnsi="Calibri" w:cs="Calibri"/>
+          <w:b/>
+          <w:bCs/>
+          <w:u w:val="single"/>
+          <w:lang w:val="en-US"/>
+        </w:rPr>
+      </w:pPr>
+      <w:proofErr w:type="spellStart"/>
+      <w:r>
+        <w:rPr>
+          <w:rFonts w:ascii="Calibri" w:hAnsi="Calibri" w:cs="Calibri"/>
+          <w:b/>
+          <w:bCs/>
+          <w:u w:val="single"/>
+          <w:lang w:val="en-US"/>
+        </w:rPr>
+        <w:t>Verfication</w:t>
+      </w:r>
+      <w:proofErr w:type="spellEnd"/>
+      <w:r>
+        <w:rPr>
+          <w:rFonts w:ascii="Calibri" w:hAnsi="Calibri" w:cs="Calibri"/>
+          <w:b/>
+          <w:bCs/>
+          <w:u w:val="single"/>
+          <w:lang w:val="en-US"/>
+        </w:rPr>
+        <w:t xml:space="preserve"> </w:t>
+      </w:r>
+    </w:p>
+    <w:p>
+      <w:pPr>
+        <w:rPr>
+          <w:rFonts w:ascii="Calibri" w:hAnsi="Calibri" w:cs="Calibri"/>
+          <w:lang w:val="en-US"/>
+        </w:rPr>
+      </w:pPr>
+      <w:r>
+        <w:rPr>
+          <w:rFonts w:ascii="Calibri" w:hAnsi="Calibri" w:cs="Calibri"/>
+          <w:lang w:val="en-US"/>
+        </w:rPr>
+        <w:t>Here I’m starting the verification process of the design.</w:t>
+      </w:r>
+    </w:p>
+    <w:p>
+      <w:pPr>
+        <w:rPr>
+          <w:rFonts w:ascii="Calibri" w:hAnsi="Calibri" w:cs="Calibri"/>
+          <w:b/>
+          <w:bCs/>
+          <w:u w:val="single"/>
+          <w:lang w:val="en-US"/>
+        </w:rPr>
+      </w:pPr>
+      <w:r>
+        <w:rPr>
+          <w:rFonts w:ascii="Calibri" w:hAnsi="Calibri" w:cs="Calibri"/>
+          <w:b/>
+          <w:bCs/>
+          <w:u w:val="single"/>
+          <w:lang w:val="en-US"/>
+        </w:rPr>
         <w:t>ALU</w:t>
       </w:r>
     </w:p>
@@ -9870,21 +11374,7 @@
           <w:rFonts w:ascii="Calibri" w:hAnsi="Calibri" w:cs="Calibri"/>
           <w:lang w:val="en-US"/>
         </w:rPr>
-        <w:t xml:space="preserve"> </w:t>
-      </w:r>
-      <w:r>
-        <w:rPr>
-          <w:rFonts w:ascii="Calibri" w:hAnsi="Calibri" w:cs="Calibri"/>
-          <w:lang w:val="en-US"/>
-        </w:rPr>
-        <w:t xml:space="preserve">. </w:t>
-      </w:r>
-      <w:r>
-        <w:rPr>
-          <w:rFonts w:ascii="Calibri" w:hAnsi="Calibri" w:cs="Calibri"/>
-          <w:lang w:val="en-US"/>
-        </w:rPr>
-        <w:t xml:space="preserve">Flags: </w:t>
+        <w:t xml:space="preserve"> . Flags: </w:t>
       </w:r>
       <w:proofErr w:type="gramStart"/>
       <w:r>
@@ -9994,8 +11484,9 @@
           <w:iCs/>
           <w:lang w:val="en-US"/>
         </w:rPr>
-        <w:t xml:space="preserve"> space to cover.</w:t>
-      </w:r>
+        <w:t xml:space="preserve"> space to </w:t>
+      </w:r>
+      <w:proofErr w:type="gramStart"/>
       <w:r>
         <w:rPr>
           <w:rFonts w:ascii="Calibri" w:hAnsi="Calibri" w:cs="Calibri"/>
@@ -10003,7 +11494,26 @@
           <w:iCs/>
           <w:lang w:val="en-US"/>
         </w:rPr>
-        <w:t>(100%)</w:t>
+        <w:t>cover.</w:t>
+      </w:r>
+      <w:r>
+        <w:rPr>
+          <w:rFonts w:ascii="Calibri" w:hAnsi="Calibri" w:cs="Calibri"/>
+          <w:i/>
+          <w:iCs/>
+          <w:lang w:val="en-US"/>
+        </w:rPr>
+        <w:t>(</w:t>
+      </w:r>
+      <w:proofErr w:type="gramEnd"/>
+      <w:r>
+        <w:rPr>
+          <w:rFonts w:ascii="Calibri" w:hAnsi="Calibri" w:cs="Calibri"/>
+          <w:i/>
+          <w:iCs/>
+          <w:lang w:val="en-US"/>
+        </w:rPr>
+        <w:t>100%)</w:t>
       </w:r>
     </w:p>
     <w:p>
@@ -10295,14 +11805,7 @@
           <w:rFonts w:ascii="Calibri" w:eastAsiaTheme="minorEastAsia" w:hAnsi="Calibri" w:cs="Calibri"/>
           <w:lang w:val="en-US"/>
         </w:rPr>
-        <w:t xml:space="preserve"> , </w:t>
-      </w:r>
-      <w:r>
-        <w:rPr>
-          <w:rFonts w:ascii="Calibri" w:eastAsiaTheme="minorEastAsia" w:hAnsi="Calibri" w:cs="Calibri"/>
-          <w:lang w:val="en-US"/>
-        </w:rPr>
-        <w:t>Signed 32</w:t>
+        <w:t xml:space="preserve"> , Signed 32</w:t>
       </w:r>
       <w:proofErr w:type="gramStart"/>
       <w:r>
@@ -10398,14 +11901,7 @@
             <w:rFonts w:ascii="Cambria Math" w:eastAsiaTheme="minorEastAsia" w:hAnsi="Cambria Math" w:cs="Calibri"/>
             <w:lang w:val="en-US"/>
           </w:rPr>
-          <m:t>-1}</m:t>
-        </m:r>
-        <m:r>
-          <w:rPr>
-            <w:rFonts w:ascii="Cambria Math" w:eastAsiaTheme="minorEastAsia" w:hAnsi="Cambria Math" w:cs="Calibri"/>
-            <w:lang w:val="en-US"/>
-          </w:rPr>
-          <m:t xml:space="preserve"> </m:t>
+          <m:t xml:space="preserve">-1} </m:t>
         </m:r>
       </m:oMath>
     </w:p>
@@ -10514,22 +12010,31 @@
           <w:rFonts w:ascii="Calibri" w:hAnsi="Calibri" w:cs="Calibri"/>
           <w:lang w:val="en-US"/>
         </w:rPr>
+        <w:t xml:space="preserve"> and </w:t>
+      </w:r>
+      <w:proofErr w:type="gramStart"/>
+      <w:r>
+        <w:rPr>
+          <w:rFonts w:ascii="Calibri" w:hAnsi="Calibri" w:cs="Calibri"/>
+          <w:lang w:val="en-US"/>
+        </w:rPr>
+        <w:t>N ,</w:t>
+      </w:r>
+      <w:proofErr w:type="gramEnd"/>
+      <w:r>
+        <w:rPr>
+          <w:rFonts w:ascii="Calibri" w:hAnsi="Calibri" w:cs="Calibri"/>
+          <w:lang w:val="en-US"/>
+        </w:rPr>
         <w:t xml:space="preserve"> </w:t>
       </w:r>
-      <w:r>
-        <w:rPr>
-          <w:rFonts w:ascii="Calibri" w:hAnsi="Calibri" w:cs="Calibri"/>
-          <w:lang w:val="en-US"/>
-        </w:rPr>
-        <w:t xml:space="preserve">and </w:t>
-      </w:r>
       <w:proofErr w:type="gramStart"/>
       <w:r>
         <w:rPr>
           <w:rFonts w:ascii="Calibri" w:hAnsi="Calibri" w:cs="Calibri"/>
           <w:lang w:val="en-US"/>
         </w:rPr>
-        <w:t>N ,</w:t>
+        <w:t>V ,</w:t>
       </w:r>
       <w:proofErr w:type="gramEnd"/>
       <w:r>
@@ -10537,30 +12042,7 @@
           <w:rFonts w:ascii="Calibri" w:hAnsi="Calibri" w:cs="Calibri"/>
           <w:lang w:val="en-US"/>
         </w:rPr>
-        <w:t xml:space="preserve"> </w:t>
-      </w:r>
-      <w:proofErr w:type="gramStart"/>
-      <w:r>
-        <w:rPr>
-          <w:rFonts w:ascii="Calibri" w:hAnsi="Calibri" w:cs="Calibri"/>
-          <w:lang w:val="en-US"/>
-        </w:rPr>
-        <w:t>V ,</w:t>
-      </w:r>
-      <w:proofErr w:type="gramEnd"/>
-      <w:r>
-        <w:rPr>
-          <w:rFonts w:ascii="Calibri" w:hAnsi="Calibri" w:cs="Calibri"/>
-          <w:lang w:val="en-US"/>
-        </w:rPr>
-        <w:t xml:space="preserve"> C.</w:t>
-      </w:r>
-      <w:r>
-        <w:rPr>
-          <w:rFonts w:ascii="Calibri" w:hAnsi="Calibri" w:cs="Calibri"/>
-          <w:lang w:val="en-US"/>
-        </w:rPr>
-        <w:t xml:space="preserve"> = {0,1}</w:t>
+        <w:t xml:space="preserve"> C. = {0,1}</w:t>
       </w:r>
     </w:p>
     <w:p>

</xml_diff>